<commit_message>
Modificação no  scroll e layout dos chips de linhas e empresas
</commit_message>
<xml_diff>
--- a/dados/modelo_os_corrida_it.docx
+++ b/dados/modelo_os_corrida_it.docx
@@ -250,8 +250,6 @@
               </w:rPr>
               <w:t>2</w:t>
             </w:r>
-            <w:bookmarkStart w:id="0" w:name="_GoBack"/>
-            <w:bookmarkEnd w:id="0"/>
           </w:p>
         </w:tc>
       </w:tr>
@@ -1152,7 +1150,13 @@
               <w:rPr>
                 <w:rFonts w:ascii="Times New Roman" w:hAnsi="Times New Roman" w:cs="Times New Roman"/>
               </w:rPr>
-              <w:t xml:space="preserve">, que será realizada no dia </w:t>
+              <w:t>, que será realizada</w:t>
+            </w:r>
+            <w:r>
+              <w:rPr>
+                <w:rFonts w:ascii="Times New Roman" w:hAnsi="Times New Roman" w:cs="Times New Roman"/>
+              </w:rPr>
+              <w:t xml:space="preserve"> </w:t>
             </w:r>
             <w:r>
               <w:rPr>
@@ -1341,13 +1345,15 @@
               <w:rPr>
                 <w:rFonts w:ascii="Times New Roman" w:hAnsi="Times New Roman" w:cs="Times New Roman"/>
               </w:rPr>
-              <w:t>do evento</w:t>
-            </w:r>
+              <w:t xml:space="preserve">da corrida </w:t>
+            </w:r>
+            <w:bookmarkStart w:id="0" w:name="_GoBack"/>
+            <w:bookmarkEnd w:id="0"/>
             <w:r>
               <w:rPr>
                 <w:rFonts w:ascii="Times New Roman" w:hAnsi="Times New Roman" w:cs="Times New Roman"/>
               </w:rPr>
-              <w:t xml:space="preserve"> enviados pelo solicitante</w:t>
+              <w:t>enviados pelo solicitante</w:t>
             </w:r>
             <w:r>
               <w:rPr>

</xml_diff>